<commit_message>
Tipografia matematica real, formato para GitHub y recursos de la clase 1
Word:
- scripts/latex_a_omml.py traduce la notacion a ecuaciones OMML nativas de
  Word (fracciones, raices, exponentes, delimitadores que se estiran)
- cuerpo del documento en Cambria, la serif que hace juego con Cambria Math
- sublistas indentadas para los items a), b), c)

Markdown:
- delimitador de formulas $`...`$, que GitHub sabe renderizar y no choca
  con los precios en pesos
- items de cada ejercicio en vertical, uno por linea
- parrafos separados por linea en blanco para que GitHub no los pegue

Recursos de la clase 1:
- recursos/interactivos/clase_01_numeros_reales.html: 32 preguntas
  autocorregibles con explicacion y marcador
- recursos/imprimibles/clase_01_actividad_imprimible.html: taller de dos
  hojas con ilustraciones SVG y hoja de respuestas del docente

Co-Authored-By: Claude Opus 5 <noreply@anthropic.com>
</commit_message>
<xml_diff>
--- a/entregables/word/clase_01.docx
+++ b/entregables/word/clase_01.docx
@@ -1666,33 +1666,36 @@
         <w:t xml:space="preserve">: es fracción de enteros y no da un entero </w:t>
       </w:r>
       <m:oMath>
-        <m:r>
-          <m:t xml:space="preserve">(</m:t>
-        </m:r>
-        <m:f>
-          <m:fPr>
+        <m:d>
+          <m:dPr>
+            <m:begChr m:val="("/>
+            <m:endChr m:val=")"/>
             <m:ctrlPr/>
-          </m:fPr>
-          <m:num>
+          </m:dPr>
+          <m:e>
+            <m:f>
+              <m:fPr>
+                <m:ctrlPr/>
+              </m:fPr>
+              <m:num>
+                <m:r>
+                  <m:t xml:space="preserve">2</m:t>
+                </m:r>
+              </m:num>
+              <m:den>
+                <m:r>
+                  <m:t xml:space="preserve">5</m:t>
+                </m:r>
+              </m:den>
+            </m:f>
             <m:r>
-              <m:t xml:space="preserve">2</m:t>
+              <m:t xml:space="preserve">=</m:t>
             </m:r>
-          </m:num>
-          <m:den>
             <m:r>
-              <m:t xml:space="preserve">5</m:t>
+              <m:t xml:space="preserve">0,4</m:t>
             </m:r>
-          </m:den>
-        </m:f>
-        <m:r>
-          <m:t xml:space="preserve">=</m:t>
-        </m:r>
-        <m:r>
-          <m:t xml:space="preserve">0,4</m:t>
-        </m:r>
-        <m:r>
-          <m:t xml:space="preserve">)</m:t>
-        </m:r>
+          </m:e>
+        </m:d>
       </m:oMath>
       <w:r>
         <w:rPr>
@@ -2855,6 +2858,9 @@
       </w:r>
     </w:p>
     <w:p>
+      <w:pPr>
+        <w:pStyle w:val="ListBullet2"/>
+      </w:pPr>
       <w:r>
         <w:rPr>
           <w:b w:val="0"/>
@@ -2863,6 +2869,9 @@
       </w:r>
     </w:p>
     <w:p>
+      <w:pPr>
+        <w:pStyle w:val="ListBullet2"/>
+      </w:pPr>
       <w:r>
         <w:rPr>
           <w:b w:val="0"/>
@@ -2885,6 +2894,9 @@
       </w:r>
     </w:p>
     <w:p>
+      <w:pPr>
+        <w:pStyle w:val="ListBullet2"/>
+      </w:pPr>
       <w:r>
         <w:rPr>
           <w:b w:val="0"/>
@@ -2907,6 +2919,9 @@
       </w:r>
     </w:p>
     <w:p>
+      <w:pPr>
+        <w:pStyle w:val="ListBullet2"/>
+      </w:pPr>
       <w:r>
         <w:rPr>
           <w:b w:val="0"/>
@@ -2915,6 +2930,9 @@
       </w:r>
     </w:p>
     <w:p>
+      <w:pPr>
+        <w:pStyle w:val="ListBullet2"/>
+      </w:pPr>
       <w:r>
         <w:rPr>
           <w:b w:val="0"/>
@@ -2960,7 +2978,40 @@
         <w:rPr>
           <w:b w:val="0"/>
         </w:rPr>
-        <w:t>4. Escribe un número que cumpla cada condición: a) racional pero no entero; b) entero pero no natural; c) irracional entre 1 y 2.</w:t>
+        <w:t>4. Escribe un número que cumpla cada condición:</w:t>
+      </w:r>
+    </w:p>
+    <w:p>
+      <w:pPr>
+        <w:pStyle w:val="ListBullet2"/>
+      </w:pPr>
+      <w:r>
+        <w:rPr>
+          <w:b w:val="0"/>
+        </w:rPr>
+        <w:t>a) racional pero no entero</w:t>
+      </w:r>
+    </w:p>
+    <w:p>
+      <w:pPr>
+        <w:pStyle w:val="ListBullet2"/>
+      </w:pPr>
+      <w:r>
+        <w:rPr>
+          <w:b w:val="0"/>
+        </w:rPr>
+        <w:t>b) entero pero no natural</w:t>
+      </w:r>
+    </w:p>
+    <w:p>
+      <w:pPr>
+        <w:pStyle w:val="ListBullet2"/>
+      </w:pPr>
+      <w:r>
+        <w:rPr>
+          <w:b w:val="0"/>
+        </w:rPr>
+        <w:t>c) irracional entre 1 y 2.</w:t>
       </w:r>
     </w:p>
     <w:p>
@@ -2971,18 +3022,34 @@
         <w:rPr>
           <w:b w:val="0"/>
         </w:rPr>
-        <w:t xml:space="preserve">5. Decide si cada decimal representa un racional o un irracional: a) </w:t>
+        <w:t>5. Decide si cada decimal representa un racional o un irracional:</w:t>
+      </w:r>
+    </w:p>
+    <w:p>
+      <w:pPr>
+        <w:pStyle w:val="ListBullet2"/>
+      </w:pPr>
+      <w:r>
+        <w:rPr>
+          <w:b w:val="0"/>
+        </w:rPr>
+        <w:t xml:space="preserve">a) </w:t>
       </w:r>
       <m:oMath>
         <m:r>
           <m:t xml:space="preserve">0,5</m:t>
         </m:r>
       </m:oMath>
+    </w:p>
+    <w:p>
+      <w:pPr>
+        <w:pStyle w:val="ListBullet2"/>
+      </w:pPr>
       <w:r>
         <w:rPr>
           <w:b w:val="0"/>
         </w:rPr>
-        <w:t xml:space="preserve"> b) </w:t>
+        <w:t xml:space="preserve">b) </w:t>
       </w:r>
       <m:oMath>
         <m:r>
@@ -2995,11 +3062,16 @@
           <m:t xml:space="preserve">…</m:t>
         </m:r>
       </m:oMath>
+    </w:p>
+    <w:p>
+      <w:pPr>
+        <w:pStyle w:val="ListBullet2"/>
+      </w:pPr>
       <w:r>
         <w:rPr>
           <w:b w:val="0"/>
         </w:rPr>
-        <w:t xml:space="preserve"> c) </w:t>
+        <w:t xml:space="preserve">c) </w:t>
       </w:r>
       <m:oMath>
         <m:r>
@@ -3012,11 +3084,16 @@
           <m:t xml:space="preserve">…</m:t>
         </m:r>
       </m:oMath>
+    </w:p>
+    <w:p>
+      <w:pPr>
+        <w:pStyle w:val="ListBullet2"/>
+      </w:pPr>
       <w:r>
         <w:rPr>
           <w:b w:val="0"/>
         </w:rPr>
-        <w:t xml:space="preserve"> d) </w:t>
+        <w:t xml:space="preserve">d) </w:t>
       </w:r>
       <m:oMath>
         <m:r>
@@ -3029,11 +3106,16 @@
           <m:t xml:space="preserve">…</m:t>
         </m:r>
       </m:oMath>
+    </w:p>
+    <w:p>
+      <w:pPr>
+        <w:pStyle w:val="ListBullet2"/>
+      </w:pPr>
       <w:r>
         <w:rPr>
           <w:b w:val="0"/>
         </w:rPr>
-        <w:t xml:space="preserve"> e) </w:t>
+        <w:t xml:space="preserve">e) </w:t>
       </w:r>
       <m:oMath>
         <m:r>
@@ -3063,29 +3145,50 @@
         <w:rPr>
           <w:b w:val="0"/>
         </w:rPr>
-        <w:t xml:space="preserve">6. Escribe como fracción: a) </w:t>
+        <w:t>6. Escribe como fracción:</w:t>
+      </w:r>
+    </w:p>
+    <w:p>
+      <w:pPr>
+        <w:pStyle w:val="ListBullet2"/>
+      </w:pPr>
+      <w:r>
+        <w:rPr>
+          <w:b w:val="0"/>
+        </w:rPr>
+        <w:t xml:space="preserve">a) </w:t>
       </w:r>
       <m:oMath>
         <m:r>
           <m:t xml:space="preserve">0,4</m:t>
         </m:r>
       </m:oMath>
+    </w:p>
+    <w:p>
+      <w:pPr>
+        <w:pStyle w:val="ListBullet2"/>
+      </w:pPr>
       <w:r>
         <w:rPr>
           <w:b w:val="0"/>
         </w:rPr>
-        <w:t xml:space="preserve"> b) </w:t>
+        <w:t xml:space="preserve">b) </w:t>
       </w:r>
       <m:oMath>
         <m:r>
           <m:t xml:space="preserve">0,125</m:t>
         </m:r>
       </m:oMath>
+    </w:p>
+    <w:p>
+      <w:pPr>
+        <w:pStyle w:val="ListBullet2"/>
+      </w:pPr>
       <w:r>
         <w:rPr>
           <w:b w:val="0"/>
         </w:rPr>
-        <w:t xml:space="preserve"> c) </w:t>
+        <w:t xml:space="preserve">c) </w:t>
       </w:r>
       <m:oMath>
         <m:r>
@@ -3098,11 +3201,16 @@
           <m:t xml:space="preserve">…</m:t>
         </m:r>
       </m:oMath>
+    </w:p>
+    <w:p>
+      <w:pPr>
+        <w:pStyle w:val="ListBullet2"/>
+      </w:pPr>
       <w:r>
         <w:rPr>
           <w:b w:val="0"/>
         </w:rPr>
-        <w:t xml:space="preserve"> d) </w:t>
+        <w:t xml:space="preserve">d) </w:t>
       </w:r>
       <m:oMath>
         <m:r>
@@ -3408,7 +3516,29 @@
         <w:rPr>
           <w:b w:val="0"/>
         </w:rPr>
-        <w:t>11. El pronóstico del día registró: Bogotá 8,5 °C; Leticia 31 °C; Tunja −1,5 °C; Cali 26,7 °C; Nevado del Ruiz −4,2 °C. a) Ordena las temperaturas de menor a mayor. b) ¿Cuáles son números enteros?</w:t>
+        <w:t>11. El pronóstico del día registró: Bogotá 8,5 °C; Leticia 31 °C; Tunja −1,5 °C; Cali 26,7 °C; Nevado del Ruiz −4,2 °C.</w:t>
+      </w:r>
+    </w:p>
+    <w:p>
+      <w:pPr>
+        <w:pStyle w:val="ListBullet2"/>
+      </w:pPr>
+      <w:r>
+        <w:rPr>
+          <w:b w:val="0"/>
+        </w:rPr>
+        <w:t>a) Ordena las temperaturas de menor a mayor.</w:t>
+      </w:r>
+    </w:p>
+    <w:p>
+      <w:pPr>
+        <w:pStyle w:val="ListBullet2"/>
+      </w:pPr>
+      <w:r>
+        <w:rPr>
+          <w:b w:val="0"/>
+        </w:rPr>
+        <w:t>b) ¿Cuáles son números enteros?</w:t>
       </w:r>
     </w:p>
     <w:p>
@@ -3419,7 +3549,40 @@
         <w:rPr>
           <w:b w:val="0"/>
         </w:rPr>
-        <w:t>12. Camila tiene $85.000 ahorrados y debe $120.000 de la cuota del celular. a) Representa las dos cantidades con números con signo. b) ¿A qué familia pertenece cada una? c) ¿Cuál de los dos números es mayor?</w:t>
+        <w:t>12. Camila tiene $85.000 ahorrados y debe $120.000 de la cuota del celular.</w:t>
+      </w:r>
+    </w:p>
+    <w:p>
+      <w:pPr>
+        <w:pStyle w:val="ListBullet2"/>
+      </w:pPr>
+      <w:r>
+        <w:rPr>
+          <w:b w:val="0"/>
+        </w:rPr>
+        <w:t>a) Representa las dos cantidades con números con signo.</w:t>
+      </w:r>
+    </w:p>
+    <w:p>
+      <w:pPr>
+        <w:pStyle w:val="ListBullet2"/>
+      </w:pPr>
+      <w:r>
+        <w:rPr>
+          <w:b w:val="0"/>
+        </w:rPr>
+        <w:t>b) ¿A qué familia pertenece cada una?</w:t>
+      </w:r>
+    </w:p>
+    <w:p>
+      <w:pPr>
+        <w:pStyle w:val="ListBullet2"/>
+      </w:pPr>
+      <w:r>
+        <w:rPr>
+          <w:b w:val="0"/>
+        </w:rPr>
+        <w:t>c) ¿Cuál de los dos números es mayor?</w:t>
       </w:r>
     </w:p>
     <w:p>
@@ -3430,7 +3593,51 @@
         <w:rPr>
           <w:b w:val="0"/>
         </w:rPr>
-        <w:t>13. Un terreno cuadrado tiene 20 m² de área. a) ¿Cuánto mide su lado? b) ¿Es racional o irracional? c) ¿Entre qué dos enteros está? d) ¿Alcanzan 18 m de malla para cercarlo?</w:t>
+        <w:t>13. Un terreno cuadrado tiene 20 m² de área.</w:t>
+      </w:r>
+    </w:p>
+    <w:p>
+      <w:pPr>
+        <w:pStyle w:val="ListBullet2"/>
+      </w:pPr>
+      <w:r>
+        <w:rPr>
+          <w:b w:val="0"/>
+        </w:rPr>
+        <w:t>a) ¿Cuánto mide su lado?</w:t>
+      </w:r>
+    </w:p>
+    <w:p>
+      <w:pPr>
+        <w:pStyle w:val="ListBullet2"/>
+      </w:pPr>
+      <w:r>
+        <w:rPr>
+          <w:b w:val="0"/>
+        </w:rPr>
+        <w:t>b) ¿Es racional o irracional?</w:t>
+      </w:r>
+    </w:p>
+    <w:p>
+      <w:pPr>
+        <w:pStyle w:val="ListBullet2"/>
+      </w:pPr>
+      <w:r>
+        <w:rPr>
+          <w:b w:val="0"/>
+        </w:rPr>
+        <w:t>c) ¿Entre qué dos enteros está?</w:t>
+      </w:r>
+    </w:p>
+    <w:p>
+      <w:pPr>
+        <w:pStyle w:val="ListBullet2"/>
+      </w:pPr>
+      <w:r>
+        <w:rPr>
+          <w:b w:val="0"/>
+        </w:rPr>
+        <w:t>d) ¿Alcanzan 18 m de malla para cercarlo?</w:t>
       </w:r>
     </w:p>
     <w:p>
@@ -3497,7 +3704,18 @@
         <w:rPr>
           <w:b w:val="0"/>
         </w:rPr>
-        <w:t>. a) ¿</w:t>
+        <w:t>.</w:t>
+      </w:r>
+    </w:p>
+    <w:p>
+      <w:pPr>
+        <w:pStyle w:val="ListBullet2"/>
+      </w:pPr>
+      <w:r>
+        <w:rPr>
+          <w:b w:val="0"/>
+        </w:rPr>
+        <w:t>a) ¿</w:t>
       </w:r>
       <m:oMath>
         <m:f>
@@ -3520,7 +3738,29 @@
         <w:rPr>
           <w:b w:val="0"/>
         </w:rPr>
-        <w:t xml:space="preserve"> es racional o irracional? b) ¿Cuál de los dos es mayor? c) ¿Por qué </w:t>
+        <w:t xml:space="preserve"> es racional o irracional?</w:t>
+      </w:r>
+    </w:p>
+    <w:p>
+      <w:pPr>
+        <w:pStyle w:val="ListBullet2"/>
+      </w:pPr>
+      <w:r>
+        <w:rPr>
+          <w:b w:val="0"/>
+        </w:rPr>
+        <w:t>b) ¿Cuál de los dos es mayor?</w:t>
+      </w:r>
+    </w:p>
+    <w:p>
+      <w:pPr>
+        <w:pStyle w:val="ListBullet2"/>
+      </w:pPr>
+      <w:r>
+        <w:rPr>
+          <w:b w:val="0"/>
+        </w:rPr>
+        <w:t xml:space="preserve">c) ¿Por qué </w:t>
       </w:r>
       <m:oMath>
         <m:f>

</xml_diff>